<commit_message>
Fix LaTeX formula in README and update Step 3 wording/screenshots in Word and PDF manuals
</commit_message>
<xml_diff>
--- a/QCI&AI資料模型蒐集工具_操作手冊.docx
+++ b/QCI&AI資料模型蒐集工具_操作手冊.docx
@@ -679,7 +679,7 @@
               <w:rPr>
                 <w:b/>
               </w:rPr>
-              <w:t>HEGAIImage_v1 (圖圖相符評分)</w:t>
+              <w:t>HEGAIImage_v1 (評估 Generated/Shooting Image 與 GAIImage 相符程度)</w:t>
             </w:r>
           </w:p>
         </w:tc>
@@ -714,7 +714,7 @@
               <w:rPr>
                 <w:b/>
               </w:rPr>
-              <w:t>HEGAIImage_v2 (圖文相符評分)</w:t>
+              <w:t>HEGAIImage_v2 (評估 GAIText (English) 圖片與 GAIImage 相符程度)</w:t>
             </w:r>
           </w:p>
         </w:tc>
@@ -974,21 +974,49 @@
         <w:t xml:space="preserve">• 生成 GAIImage：</w:t>
       </w:r>
       <w:r>
-        <w:t xml:space="preserve">再次前往 KWS AI (Text/Voice to Image)，輸入圖片描述文字 GAIText (English) 來生成新圖片 GAIImage 並上傳。</w:t>
-      </w:r>
-    </w:p>
-    <w:p>
-      <w:pPr>
-        <w:spacing w:before="60" w:after="80" w:line="320" w:lineRule="auto"/>
-      </w:pPr>
-      <w:r>
-        <w:rPr>
-          <w:b/>
-        </w:rPr>
-        <w:t xml:space="preserve">• 雙重相符度評估：</w:t>
-      </w:r>
-      <w:r>
-        <w:t xml:space="preserve">針對「原圖 vs. GAIImage」設定 HEGAIImage_v1 (0–10 分)，並針對「GAIText (English) vs. GAIImage」設定 HEGAIImage_v2 (0–10 分)。系統會依權重即時計算 HEGAIImage 分數，完成後點擊「儲存並前往收集清單」。</w:t>
+        <w:t xml:space="preserve">再次前往 KWS AI (Text/Voice to Image)，輸入圖片描述文字 GAIText (English) 來生成圖片 GAIImage 並上傳。</w:t>
+      </w:r>
+    </w:p>
+    <w:p>
+      <w:pPr>
+        <w:spacing w:before="60" w:after="80" w:line="320" w:lineRule="auto"/>
+      </w:pPr>
+      <w:r>
+        <w:rPr>
+          <w:b/>
+        </w:rPr>
+        <w:t xml:space="preserve">• 第一組對照（評估 Generated Image / Shooting Image 與 GAIImage 的相符程度）：</w:t>
+      </w:r>
+      <w:r>
+        <w:t xml:space="preserve">左側顯示 Step 1 原圖（Generated Image 或 Shooting Image），右側顯示 GAIImage，依兩張圖片相符程度設定 HEGAIImage_v1 (0–10 分)。</w:t>
+      </w:r>
+    </w:p>
+    <w:p>
+      <w:pPr>
+        <w:spacing w:before="60" w:after="80" w:line="320" w:lineRule="auto"/>
+      </w:pPr>
+      <w:r>
+        <w:rPr>
+          <w:b/>
+        </w:rPr>
+        <w:t xml:space="preserve">• 第二組對照（評估 GAIText (English) 圖片與 GAIImage 的相符程度）：</w:t>
+      </w:r>
+      <w:r>
+        <w:t xml:space="preserve">文字順序與介面左、右配置完全匹配——左側顯示圖片描述文字 GAIText (English)，右側顯示 GAIImage，依相符程度設定 HEGAIImage_v2 (0–10 分)。</w:t>
+      </w:r>
+    </w:p>
+    <w:p>
+      <w:pPr>
+        <w:spacing w:before="60" w:after="80" w:line="320" w:lineRule="auto"/>
+      </w:pPr>
+      <w:r>
+        <w:rPr>
+          <w:b/>
+        </w:rPr>
+        <w:t xml:space="preserve">• 自動計算與儲存：</w:t>
+      </w:r>
+      <w:r>
+        <w:t xml:space="preserve">系統會依頂端權重即時計算 HEGAIImage 分數，完成後點擊「💾 儲存並前往收集清單」。</w:t>
       </w:r>
     </w:p>
     <w:p>
@@ -1042,7 +1070,7 @@
           <w:sz w:val="18"/>
           <w:szCs w:val="18"/>
         </w:rPr>
-        <w:t>圖 5：Step 3 上傳 GAIImage 與 HEGAIImage_v1、v2 對照評分介面</w:t>
+        <w:t>圖 5：Step 3 上傳 GAIImage 與 HEGAIImage_v1、HEGAIImage_v2 對照評分介面</w:t>
       </w:r>
     </w:p>
     <w:p>

</xml_diff>